<commit_message>
Update portfolio content and frontend interactions
</commit_message>
<xml_diff>
--- a/images/Hamza_Salahuddin_Resume.docx
+++ b/images/Hamza_Salahuddin_Resume.docx
@@ -139,7 +139,7 @@
           <w:sz w:val="28"/>
           <w:szCs w:val="28"/>
         </w:rPr>
-        <w:t>mazeadone</w:t>
+        <w:t>mrbesetti</w:t>
       </w:r>
       <w:proofErr w:type="spellEnd"/>
     </w:p>
@@ -207,6 +207,9 @@
         <w:t xml:space="preserve"> PostgreSQL</w:t>
       </w:r>
       <w:r>
+        <w:t>,</w:t>
+      </w:r>
+      <w:r>
         <w:t xml:space="preserve"> </w:t>
       </w:r>
       <w:proofErr w:type="spellStart"/>
@@ -230,7 +233,16 @@
         <w:t xml:space="preserve">Frontend </w:t>
       </w:r>
       <w:r>
-        <w:t>| React, Vite, Next.js</w:t>
+        <w:t xml:space="preserve">| React, </w:t>
+      </w:r>
+      <w:r>
+        <w:t xml:space="preserve">Tailwind CSS, </w:t>
+      </w:r>
+      <w:r>
+        <w:t xml:space="preserve">Vite, </w:t>
+      </w:r>
+      <w:r>
+        <w:t>Three.js</w:t>
       </w:r>
     </w:p>
     <w:p>
@@ -255,7 +267,28 @@
         <w:t xml:space="preserve"> </w:t>
       </w:r>
       <w:r>
-        <w:t xml:space="preserve">GitHub, Docker, Postman, </w:t>
+        <w:t>GitHub,</w:t>
+      </w:r>
+      <w:r>
+        <w:t xml:space="preserve"> VS Code</w:t>
+      </w:r>
+      <w:r>
+        <w:t>,</w:t>
+      </w:r>
+      <w:r>
+        <w:t xml:space="preserve"> </w:t>
+      </w:r>
+      <w:r>
+        <w:t xml:space="preserve">Codex, </w:t>
+      </w:r>
+      <w:r>
+        <w:t>Postman</w:t>
+      </w:r>
+      <w:r>
+        <w:t>,</w:t>
+      </w:r>
+      <w:r>
+        <w:t xml:space="preserve"> </w:t>
       </w:r>
       <w:proofErr w:type="spellStart"/>
       <w:r>
@@ -263,13 +296,25 @@
       </w:r>
       <w:proofErr w:type="spellEnd"/>
       <w:r>
-        <w:t xml:space="preserve">, VS </w:t>
-      </w:r>
-      <w:r>
-        <w:t>C</w:t>
-      </w:r>
-      <w:r>
-        <w:t>ode</w:t>
+        <w:t xml:space="preserve">, </w:t>
+      </w:r>
+      <w:r>
+        <w:t>Blender</w:t>
+      </w:r>
+      <w:r>
+        <w:t>,</w:t>
+      </w:r>
+      <w:r>
+        <w:t xml:space="preserve"> </w:t>
+      </w:r>
+      <w:r>
+        <w:t xml:space="preserve">Docker, </w:t>
+      </w:r>
+      <w:r>
+        <w:t>Unreal Engine</w:t>
+      </w:r>
+      <w:r>
+        <w:t xml:space="preserve"> 5</w:t>
       </w:r>
     </w:p>
     <w:p>
@@ -356,7 +401,7 @@
         <w:t xml:space="preserve"> – </w:t>
       </w:r>
       <w:r>
-        <w:t>Present</w:t>
+        <w:t>May 2026</w:t>
       </w:r>
     </w:p>
     <w:p>
@@ -383,18 +428,44 @@
         <w:pStyle w:val="6BulletPoints"/>
       </w:pPr>
       <w:r>
-        <w:t>Led planning and execution of ACM events for 100+ students, increasing engagement and participation.</w:t>
+        <w:t xml:space="preserve">Led planning and execution of ACM events for </w:t>
+      </w:r>
+      <w:r>
+        <w:t>15</w:t>
+      </w:r>
+      <w:r>
+        <w:t>0+ students, increasing engagement and participation.</w:t>
       </w:r>
     </w:p>
     <w:p>
       <w:pPr>
+        <w:pStyle w:val="6BulletPoints"/>
+      </w:pPr>
+      <w:r>
+        <w:t xml:space="preserve">Coordinated with respective student affairs or other chapters to showcase QR </w:t>
+      </w:r>
+      <w:r>
+        <w:t>Scavenger</w:t>
+      </w:r>
+      <w:r>
+        <w:t xml:space="preserve"> Hunt </w:t>
+      </w:r>
+      <w:r>
+        <w:t>during</w:t>
+      </w:r>
+      <w:r>
+        <w:t xml:space="preserve"> organization fair</w:t>
+      </w:r>
+      <w:r>
+        <w:t xml:space="preserve">/hackathons. </w:t>
+      </w:r>
+    </w:p>
+    <w:p>
+      <w:pPr>
         <w:pStyle w:val="4SectionHeaders"/>
       </w:pPr>
       <w:r>
-        <w:t xml:space="preserve">WORK </w:t>
-      </w:r>
-      <w:r>
-        <w:t>EXPERIENCE</w:t>
+        <w:t>WORK EXPERIENCE</w:t>
       </w:r>
     </w:p>
     <w:p>
@@ -405,25 +476,13 @@
         </w:tabs>
       </w:pPr>
       <w:r>
-        <w:t>Student Assistant</w:t>
+        <w:t xml:space="preserve">AI Model Generation Team Lead – Capstone </w:t>
       </w:r>
       <w:r>
         <w:tab/>
       </w:r>
       <w:r>
-        <w:t>September</w:t>
-      </w:r>
-      <w:r>
-        <w:t xml:space="preserve"> </w:t>
-      </w:r>
-      <w:r>
-        <w:t>2022</w:t>
-      </w:r>
-      <w:r>
-        <w:t xml:space="preserve"> – </w:t>
-      </w:r>
-      <w:r>
-        <w:t>December 2024</w:t>
+        <w:t>Jan 2026 - May 2026</w:t>
       </w:r>
     </w:p>
     <w:p>
@@ -434,16 +493,15 @@
         </w:tabs>
       </w:pPr>
       <w:r>
-        <w:t>Georgia State University</w:t>
-      </w:r>
-      <w:r>
-        <w:t xml:space="preserve"> </w:t>
+        <w:rPr>
+          <w:i/>
+          <w:iCs/>
+        </w:rPr>
+        <w:t>Gulfstream Aerospace Corporation</w:t>
       </w:r>
       <w:r>
         <w:tab/>
-      </w:r>
-      <w:r>
-        <w:t>Atlanta, GA</w:t>
+        <w:t>Savannah, GA</w:t>
       </w:r>
     </w:p>
     <w:p>
@@ -451,10 +509,135 @@
         <w:pStyle w:val="6BulletPoints"/>
       </w:pPr>
       <w:r>
-        <w:t xml:space="preserve">Led and trained a 10+ member team, improving order turnaround time and </w:t>
-      </w:r>
-      <w:r>
-        <w:t>punctuality</w:t>
+        <w:t xml:space="preserve">Led development of an AI-powered 3D asset generation platform using </w:t>
+      </w:r>
+      <w:proofErr w:type="spellStart"/>
+      <w:r>
+        <w:t>FastAPI</w:t>
+      </w:r>
+      <w:proofErr w:type="spellEnd"/>
+      <w:r>
+        <w:t>, React, Three.js, Blender, and Unreal Engine 5.</w:t>
+      </w:r>
+    </w:p>
+    <w:p>
+      <w:pPr>
+        <w:pStyle w:val="6BulletPoints"/>
+      </w:pPr>
+      <w:r>
+        <w:t>Collaborated directly with Gulfstream stakeholders and designers to translate business and visualization requirements into scalable technical solutions.</w:t>
+      </w:r>
+    </w:p>
+    <w:p>
+      <w:pPr>
+        <w:pStyle w:val="6BulletPoints"/>
+      </w:pPr>
+      <w:r>
+        <w:t xml:space="preserve">Built backend integrations for TRELLIS, </w:t>
+      </w:r>
+      <w:proofErr w:type="spellStart"/>
+      <w:r>
+        <w:t>TripoSR</w:t>
+      </w:r>
+      <w:proofErr w:type="spellEnd"/>
+      <w:r>
+        <w:t xml:space="preserve">, and </w:t>
+      </w:r>
+      <w:proofErr w:type="spellStart"/>
+      <w:r>
+        <w:t>ModelsLab</w:t>
+      </w:r>
+      <w:proofErr w:type="spellEnd"/>
+      <w:r>
+        <w:t xml:space="preserve"> to support text-to-3D and image-to-3D mesh generation workflows.</w:t>
+      </w:r>
+    </w:p>
+    <w:p>
+      <w:pPr>
+        <w:pStyle w:val="6BulletPoints"/>
+      </w:pPr>
+      <w:r>
+        <w:t>Developed Blender-based mesh normalization workflows for scaling, grounding, pivot alignment, axis correction, and Unreal Engine compatibility.</w:t>
+      </w:r>
+    </w:p>
+    <w:p>
+      <w:pPr>
+        <w:pStyle w:val="6BulletPoints"/>
+      </w:pPr>
+      <w:r>
+        <w:t>Implemented interactive 3D visualization tools with React and Three.js for mesh inspection, scaling, rotation, translation, and material previewing.</w:t>
+      </w:r>
+    </w:p>
+    <w:p>
+      <w:pPr>
+        <w:pStyle w:val="7aProject"/>
+      </w:pPr>
+      <w:r>
+        <w:t xml:space="preserve">Trainline </w:t>
+      </w:r>
+      <w:r>
+        <w:rPr>
+          <w:b w:val="0"/>
+          <w:bCs w:val="0"/>
+        </w:rPr>
+        <w:t xml:space="preserve">| Django, React, MySQL, Docker, </w:t>
+      </w:r>
+      <w:proofErr w:type="gramStart"/>
+      <w:r>
+        <w:rPr>
+          <w:b w:val="0"/>
+          <w:bCs w:val="0"/>
+        </w:rPr>
+        <w:t>Axios</w:t>
+      </w:r>
+      <w:r>
+        <w:t xml:space="preserve"> </w:t>
+      </w:r>
+      <w:r>
+        <w:rPr>
+          <w:b w:val="0"/>
+          <w:bCs w:val="0"/>
+        </w:rPr>
+        <w:t xml:space="preserve"> </w:t>
+      </w:r>
+      <w:r>
+        <w:tab/>
+      </w:r>
+      <w:proofErr w:type="gramEnd"/>
+      <w:r>
+        <w:t xml:space="preserve">Spring 2025 – Present </w:t>
+      </w:r>
+    </w:p>
+    <w:p>
+      <w:pPr>
+        <w:pStyle w:val="6BulletPoints"/>
+      </w:pPr>
+      <w:r>
+        <w:t>Built an independent full-stack train booking application using Django REST Framework, React, and a relational database with end-to-end SDLC and MVC-based architecture.</w:t>
+      </w:r>
+    </w:p>
+    <w:p>
+      <w:pPr>
+        <w:pStyle w:val="6BulletPoints"/>
+      </w:pPr>
+      <w:r>
+        <w:t>Implemented user authentication, trip browsing, ticket and seat selection, payments, notifications, and chat functionality through custom frontend and backend workflows.</w:t>
+      </w:r>
+    </w:p>
+    <w:p>
+      <w:pPr>
+        <w:pStyle w:val="6BulletPoints"/>
+      </w:pPr>
+      <w:r>
+        <w:t xml:space="preserve">Improved production readiness by documenting Docker-based deployment, environment-based secret management, </w:t>
+      </w:r>
+      <w:proofErr w:type="spellStart"/>
+      <w:r>
+        <w:t>Gunicorn</w:t>
+      </w:r>
+      <w:proofErr w:type="spellEnd"/>
+      <w:r>
+        <w:t xml:space="preserve"> configuration, security headers, and authorization/input-validation fixes.</w:t>
       </w:r>
     </w:p>
     <w:p>
@@ -465,22 +648,25 @@
         </w:tabs>
       </w:pPr>
       <w:r>
-        <w:t xml:space="preserve">AI Model Generation Team Lead – Capstone </w:t>
+        <w:t>Student Assistant</w:t>
       </w:r>
       <w:r>
         <w:tab/>
       </w:r>
       <w:r>
-        <w:t>Jan 2026 - May</w:t>
-      </w:r>
-      <w:r>
-        <w:t xml:space="preserve"> 20</w:t>
-      </w:r>
-      <w:r>
-        <w:t>26</w:t>
-      </w:r>
-      <w:r>
-        <w:t xml:space="preserve"> (Expected)</w:t>
+        <w:t>September</w:t>
+      </w:r>
+      <w:r>
+        <w:t xml:space="preserve"> </w:t>
+      </w:r>
+      <w:r>
+        <w:t>2022</w:t>
+      </w:r>
+      <w:r>
+        <w:t xml:space="preserve"> – </w:t>
+      </w:r>
+      <w:r>
+        <w:t>December 2024</w:t>
       </w:r>
     </w:p>
     <w:p>
@@ -495,349 +681,213 @@
           <w:i/>
           <w:iCs/>
         </w:rPr>
-        <w:t>Gulfstream Aerospace Corporation</w:t>
+        <w:t>Georgia State University</w:t>
+      </w:r>
+      <w:r>
+        <w:t xml:space="preserve"> </w:t>
       </w:r>
       <w:r>
         <w:tab/>
       </w:r>
       <w:r>
-        <w:t>Savannah, GA</w:t>
+        <w:t>Atlanta, GA</w:t>
       </w:r>
     </w:p>
     <w:p>
       <w:pPr>
         <w:pStyle w:val="6BulletPoints"/>
-        <w:rPr>
-          <w:rFonts w:cs="Times New Roman"/>
-          <w:spacing w:val="0"/>
-        </w:rPr>
-      </w:pPr>
-      <w:r>
-        <w:t xml:space="preserve">Leading a team building AI-driven </w:t>
-      </w:r>
-      <w:r>
-        <w:t>scenarios tailored to clienteles’ specification for real life interpretation.</w:t>
+      </w:pPr>
+      <w:r>
+        <w:t xml:space="preserve">Led and trained a 10+ member team, improving order turnaround time and </w:t>
+      </w:r>
+      <w:r>
+        <w:t>punctuality</w:t>
       </w:r>
     </w:p>
     <w:p>
       <w:pPr>
-        <w:pStyle w:val="6BulletPoints"/>
-      </w:pPr>
-      <w:r>
-        <w:t xml:space="preserve">Meshy LLM used to generate 3D models pipelined for scaling &amp; sizing through Blender &amp; rendered onto the scene </w:t>
-      </w:r>
-      <w:r>
-        <w:t xml:space="preserve">using </w:t>
-      </w:r>
-      <w:r>
-        <w:t>Unreal Engine</w:t>
-      </w:r>
-      <w:r>
-        <w:t xml:space="preserve"> 5.</w:t>
+        <w:pStyle w:val="4SectionHeaders"/>
+      </w:pPr>
+      <w:r>
+        <w:t>PROJECTS</w:t>
       </w:r>
     </w:p>
     <w:p>
       <w:pPr>
-        <w:pStyle w:val="6BulletPoints"/>
-      </w:pPr>
-      <w:r>
-        <w:t xml:space="preserve">Collaborating with Gulfstream </w:t>
-      </w:r>
-      <w:r>
-        <w:t>designers</w:t>
-      </w:r>
-      <w:r>
-        <w:t xml:space="preserve"> to translate </w:t>
-      </w:r>
-      <w:r>
-        <w:t>custom client</w:t>
-      </w:r>
-      <w:r>
-        <w:t xml:space="preserve"> requirements into </w:t>
-      </w:r>
-      <w:r>
-        <w:t>AI</w:t>
-      </w:r>
-      <w:r>
-        <w:t xml:space="preserve"> tasks.</w:t>
+        <w:pStyle w:val="7aProject"/>
+      </w:pPr>
+      <w:r>
+        <w:t xml:space="preserve">Flight Booking </w:t>
+      </w:r>
+      <w:r>
+        <w:t xml:space="preserve">Web </w:t>
+      </w:r>
+      <w:r>
+        <w:t xml:space="preserve">App </w:t>
+      </w:r>
+      <w:r>
+        <w:rPr>
+          <w:b w:val="0"/>
+          <w:bCs w:val="0"/>
+        </w:rPr>
+        <w:t>|</w:t>
+      </w:r>
+      <w:r>
+        <w:t xml:space="preserve"> </w:t>
+      </w:r>
+      <w:r>
+        <w:rPr>
+          <w:b w:val="0"/>
+          <w:bCs w:val="0"/>
+        </w:rPr>
+        <w:t xml:space="preserve">Spring, </w:t>
+      </w:r>
+      <w:r>
+        <w:rPr>
+          <w:b w:val="0"/>
+          <w:bCs w:val="0"/>
+        </w:rPr>
+        <w:t>PostgreSQL, HT</w:t>
+      </w:r>
+      <w:r>
+        <w:rPr>
+          <w:b w:val="0"/>
+          <w:bCs w:val="0"/>
+        </w:rPr>
+        <w:t>M</w:t>
+      </w:r>
+      <w:r>
+        <w:rPr>
+          <w:b w:val="0"/>
+          <w:bCs w:val="0"/>
+        </w:rPr>
+        <w:t>L/CSS</w:t>
+      </w:r>
+      <w:r>
+        <w:tab/>
+      </w:r>
+      <w:r>
+        <w:t>Fall 2024</w:t>
       </w:r>
     </w:p>
     <w:p>
       <w:pPr>
+        <w:pStyle w:val="ListParagraph"/>
+        <w:numPr>
+          <w:ilvl w:val="0"/>
+          <w:numId w:val="19"/>
+        </w:numPr>
+        <w:ind w:left="180" w:hanging="180"/>
+      </w:pPr>
+      <w:r>
+        <w:t>Designed a normalized relational schema</w:t>
+      </w:r>
+      <w:r>
+        <w:t xml:space="preserve"> for</w:t>
+      </w:r>
+      <w:r>
+        <w:t xml:space="preserve"> users, flights, </w:t>
+      </w:r>
+      <w:r>
+        <w:t>seats, authentication &amp; a CRUD based system.</w:t>
+      </w:r>
+    </w:p>
+    <w:p>
+      <w:pPr>
         <w:pStyle w:val="7aProject"/>
       </w:pPr>
       <w:r>
-        <w:t xml:space="preserve">Software Engineer (Full-Stack) – Trainline </w:t>
+        <w:t xml:space="preserve">meeting-to-tasks </w:t>
       </w:r>
       <w:r>
         <w:rPr>
           <w:b w:val="0"/>
           <w:bCs w:val="0"/>
         </w:rPr>
+        <w:t>|</w:t>
+      </w:r>
+      <w:r>
         <w:t xml:space="preserve"> </w:t>
       </w:r>
-      <w:r>
-        <w:tab/>
-      </w:r>
-      <w:r>
-        <w:t>Spring 2025</w:t>
-      </w:r>
-      <w:r>
-        <w:t xml:space="preserve"> – Present </w:t>
-      </w:r>
-    </w:p>
-    <w:p>
-      <w:pPr>
-        <w:pStyle w:val="6BulletPoints"/>
-      </w:pPr>
-      <w:r>
-        <w:t xml:space="preserve">Developed a full-stack, booking </w:t>
-      </w:r>
-      <w:r>
-        <w:t>platform with REST APIs, role-based auth</w:t>
-      </w:r>
-      <w:r>
-        <w:t>entication</w:t>
-      </w:r>
-      <w:r>
-        <w:t>, PostgreSQL schema,</w:t>
-      </w:r>
-      <w:r>
-        <w:t xml:space="preserve"> </w:t>
-      </w:r>
-      <w:r>
-        <w:t xml:space="preserve">and responsive UI with notifications. </w:t>
-      </w:r>
-    </w:p>
-    <w:p>
-      <w:pPr>
-        <w:pStyle w:val="6BulletPoints"/>
-      </w:pPr>
-      <w:r>
-        <w:t>Built modular React components using JSX/TSX with end-to-end booking flows including dashboard, authenticated user experiences, seat selection, payments, notifications, and real-time chat.</w:t>
-      </w:r>
-    </w:p>
-    <w:p>
-      <w:pPr>
-        <w:pStyle w:val="6BulletPoints"/>
-      </w:pPr>
-      <w:r>
-        <w:t xml:space="preserve">Normalized relational schema in PostgreSQL for improved data integrity &amp; relationships with every user, containerized in Docker for portability. </w:t>
-      </w:r>
-    </w:p>
-    <w:p>
-      <w:pPr>
-        <w:pStyle w:val="4SectionHeaders"/>
-      </w:pPr>
-      <w:r>
-        <w:t>PROJECTS</w:t>
-      </w:r>
-    </w:p>
-    <w:p>
-      <w:pPr>
-        <w:pStyle w:val="7aProject"/>
-      </w:pPr>
-      <w:r>
-        <w:t xml:space="preserve">Flight Booking </w:t>
-      </w:r>
-      <w:r>
-        <w:t xml:space="preserve">Web </w:t>
-      </w:r>
-      <w:r>
-        <w:t xml:space="preserve">App </w:t>
-      </w:r>
+      <w:proofErr w:type="spellStart"/>
       <w:r>
         <w:rPr>
           <w:b w:val="0"/>
           <w:bCs w:val="0"/>
         </w:rPr>
-        <w:t>|</w:t>
-      </w:r>
-      <w:r>
-        <w:t xml:space="preserve"> </w:t>
-      </w:r>
+        <w:t>FastAPI</w:t>
+      </w:r>
+      <w:proofErr w:type="spellEnd"/>
       <w:r>
         <w:rPr>
           <w:b w:val="0"/>
           <w:bCs w:val="0"/>
         </w:rPr>
-        <w:t>PostgreSQL, HT</w:t>
+        <w:t>,</w:t>
       </w:r>
       <w:r>
         <w:rPr>
           <w:b w:val="0"/>
           <w:bCs w:val="0"/>
         </w:rPr>
-        <w:t>M</w:t>
+        <w:t xml:space="preserve"> FAISS,</w:t>
       </w:r>
       <w:r>
         <w:rPr>
           <w:b w:val="0"/>
           <w:bCs w:val="0"/>
         </w:rPr>
-        <w:t>L/CSS, Spring</w:t>
-      </w:r>
-      <w:r>
-        <w:tab/>
-      </w:r>
-      <w:r>
-        <w:t>Fall 2024</w:t>
-      </w:r>
-    </w:p>
-    <w:p>
-      <w:pPr>
-        <w:pStyle w:val="6BulletPoints"/>
-      </w:pPr>
-      <w:bookmarkStart w:id="0" w:name="_Hlk219759558"/>
-      <w:bookmarkStart w:id="1" w:name="_Hlk219759519"/>
-      <w:r>
-        <w:t>D</w:t>
-      </w:r>
-      <w:r>
-        <w:t>esigned a transactional booking system</w:t>
-      </w:r>
-      <w:r>
-        <w:t xml:space="preserve"> using Sprin</w:t>
-      </w:r>
-      <w:r>
-        <w:t>g</w:t>
-      </w:r>
-      <w:r>
-        <w:t xml:space="preserve"> Boot</w:t>
-      </w:r>
-      <w:r>
-        <w:t xml:space="preserve"> with authenticated user flows, normalized relational schema, and REST APIs.</w:t>
-      </w:r>
-    </w:p>
-    <w:bookmarkEnd w:id="0"/>
-    <w:p>
-      <w:pPr>
-        <w:pStyle w:val="6BulletPoints"/>
-      </w:pPr>
-      <w:r>
-        <w:t xml:space="preserve">Implemented accessible UI patterns to support user </w:t>
-      </w:r>
-      <w:bookmarkEnd w:id="1"/>
-      <w:r>
-        <w:t>accommodations, meals, embedded in the database for data integrity and efficient data manipulation</w:t>
-      </w:r>
-    </w:p>
-    <w:p>
-      <w:pPr>
-        <w:pStyle w:val="7aProject"/>
+        <w:t xml:space="preserve"> </w:t>
+      </w:r>
+      <w:proofErr w:type="spellStart"/>
+      <w:r>
         <w:rPr>
           <w:b w:val="0"/>
           <w:bCs w:val="0"/>
         </w:rPr>
-      </w:pPr>
-      <w:r>
-        <w:t xml:space="preserve">meeting-to-tasks </w:t>
-      </w:r>
+        <w:t>Ollama</w:t>
+      </w:r>
+      <w:proofErr w:type="spellEnd"/>
       <w:r>
         <w:rPr>
           <w:b w:val="0"/>
           <w:bCs w:val="0"/>
         </w:rPr>
-        <w:t>|</w:t>
-      </w:r>
-      <w:r>
-        <w:t xml:space="preserve"> </w:t>
-      </w:r>
-      <w:proofErr w:type="spellStart"/>
+        <w:t xml:space="preserve">, </w:t>
+      </w:r>
       <w:r>
         <w:rPr>
           <w:b w:val="0"/>
           <w:bCs w:val="0"/>
         </w:rPr>
-        <w:t>FastAPI</w:t>
-      </w:r>
-      <w:proofErr w:type="spellEnd"/>
+        <w:t xml:space="preserve">Sentence-Transformers, </w:t>
+      </w:r>
       <w:r>
         <w:rPr>
           <w:b w:val="0"/>
           <w:bCs w:val="0"/>
         </w:rPr>
-        <w:t xml:space="preserve">, </w:t>
-      </w:r>
-      <w:proofErr w:type="spellStart"/>
+        <w:t xml:space="preserve">GitHub </w:t>
+      </w:r>
       <w:r>
         <w:rPr>
           <w:b w:val="0"/>
           <w:bCs w:val="0"/>
         </w:rPr>
-        <w:t>Ollama</w:t>
-      </w:r>
-      <w:proofErr w:type="spellEnd"/>
+        <w:t>REST API</w:t>
+      </w:r>
       <w:r>
         <w:rPr>
           <w:b w:val="0"/>
           <w:bCs w:val="0"/>
         </w:rPr>
-        <w:t xml:space="preserve"> (phi</w:t>
-      </w:r>
-      <w:proofErr w:type="gramStart"/>
-      <w:r>
-        <w:rPr>
-          <w:b w:val="0"/>
-          <w:bCs w:val="0"/>
-        </w:rPr>
-        <w:t>3:mini</w:t>
-      </w:r>
-      <w:proofErr w:type="gramEnd"/>
-      <w:r>
-        <w:rPr>
-          <w:b w:val="0"/>
-          <w:bCs w:val="0"/>
-        </w:rPr>
-        <w:t xml:space="preserve">), GitHub Issues </w:t>
+        <w:t xml:space="preserve"> </w:t>
       </w:r>
       <w:r>
         <w:tab/>
       </w:r>
       <w:r>
         <w:t>Fall 2025</w:t>
-      </w:r>
-    </w:p>
-    <w:p>
-      <w:pPr>
-        <w:pStyle w:val="6BulletPoints"/>
-        <w:rPr>
-          <w:b/>
-          <w:bCs/>
-        </w:rPr>
-      </w:pPr>
-      <w:r>
-        <w:t>Built a RAG-based system that converts meeting transcripts into GitHub Issues using FAISS + LLMs, reducing manual task creation after sprints with lightweight tool</w:t>
-      </w:r>
-      <w:r>
-        <w:t>s</w:t>
-      </w:r>
-      <w:r>
-        <w:t xml:space="preserve"> such as Vite for frontend</w:t>
-      </w:r>
-    </w:p>
-    <w:p>
-      <w:pPr>
-        <w:pStyle w:val="6BulletPoints"/>
-      </w:pPr>
-      <w:r>
-        <w:t xml:space="preserve">Sentence-Transformers for embeddings and FAISS (local) vector store used to better understand large transcripts (meetings) with JSON configuration for </w:t>
-      </w:r>
-      <w:proofErr w:type="spellStart"/>
-      <w:r>
-        <w:t>Ollama</w:t>
-      </w:r>
-      <w:proofErr w:type="spellEnd"/>
-      <w:r>
-        <w:t xml:space="preserve"> LLM.</w:t>
-      </w:r>
-    </w:p>
-    <w:p>
-      <w:pPr>
-        <w:pStyle w:val="6BulletPoints"/>
-      </w:pPr>
-      <w:r>
-        <w:t>Architected system for pluggable LLM backends (local and hosted APIs).</w:t>
       </w:r>
     </w:p>
     <w:sectPr>
@@ -2906,6 +2956,119 @@
     </w:lvl>
   </w:abstractNum>
   <w:abstractNum w:abstractNumId="17" w15:restartNumberingAfterBreak="0">
+    <w:nsid w:val="763F26E6"/>
+    <w:multiLevelType w:val="hybridMultilevel"/>
+    <w:tmpl w:val="EAF0AF1C"/>
+    <w:lvl w:ilvl="0" w:tplc="04090001">
+      <w:start w:val="1"/>
+      <w:numFmt w:val="bullet"/>
+      <w:lvlText w:val=""/>
+      <w:lvlJc w:val="left"/>
+      <w:pPr>
+        <w:ind w:left="360" w:hanging="360"/>
+      </w:pPr>
+      <w:rPr>
+        <w:rFonts w:ascii="Symbol" w:hAnsi="Symbol" w:hint="default"/>
+      </w:rPr>
+    </w:lvl>
+    <w:lvl w:ilvl="1" w:tplc="04090003" w:tentative="1">
+      <w:start w:val="1"/>
+      <w:numFmt w:val="bullet"/>
+      <w:lvlText w:val="o"/>
+      <w:lvlJc w:val="left"/>
+      <w:pPr>
+        <w:ind w:left="1080" w:hanging="360"/>
+      </w:pPr>
+      <w:rPr>
+        <w:rFonts w:ascii="Courier New" w:hAnsi="Courier New" w:cs="Courier New" w:hint="default"/>
+      </w:rPr>
+    </w:lvl>
+    <w:lvl w:ilvl="2" w:tplc="04090005" w:tentative="1">
+      <w:start w:val="1"/>
+      <w:numFmt w:val="bullet"/>
+      <w:lvlText w:val=""/>
+      <w:lvlJc w:val="left"/>
+      <w:pPr>
+        <w:ind w:left="1800" w:hanging="360"/>
+      </w:pPr>
+      <w:rPr>
+        <w:rFonts w:ascii="Wingdings" w:hAnsi="Wingdings" w:hint="default"/>
+      </w:rPr>
+    </w:lvl>
+    <w:lvl w:ilvl="3" w:tplc="04090001" w:tentative="1">
+      <w:start w:val="1"/>
+      <w:numFmt w:val="bullet"/>
+      <w:lvlText w:val=""/>
+      <w:lvlJc w:val="left"/>
+      <w:pPr>
+        <w:ind w:left="2520" w:hanging="360"/>
+      </w:pPr>
+      <w:rPr>
+        <w:rFonts w:ascii="Symbol" w:hAnsi="Symbol" w:hint="default"/>
+      </w:rPr>
+    </w:lvl>
+    <w:lvl w:ilvl="4" w:tplc="04090003" w:tentative="1">
+      <w:start w:val="1"/>
+      <w:numFmt w:val="bullet"/>
+      <w:lvlText w:val="o"/>
+      <w:lvlJc w:val="left"/>
+      <w:pPr>
+        <w:ind w:left="3240" w:hanging="360"/>
+      </w:pPr>
+      <w:rPr>
+        <w:rFonts w:ascii="Courier New" w:hAnsi="Courier New" w:cs="Courier New" w:hint="default"/>
+      </w:rPr>
+    </w:lvl>
+    <w:lvl w:ilvl="5" w:tplc="04090005" w:tentative="1">
+      <w:start w:val="1"/>
+      <w:numFmt w:val="bullet"/>
+      <w:lvlText w:val=""/>
+      <w:lvlJc w:val="left"/>
+      <w:pPr>
+        <w:ind w:left="3960" w:hanging="360"/>
+      </w:pPr>
+      <w:rPr>
+        <w:rFonts w:ascii="Wingdings" w:hAnsi="Wingdings" w:hint="default"/>
+      </w:rPr>
+    </w:lvl>
+    <w:lvl w:ilvl="6" w:tplc="04090001" w:tentative="1">
+      <w:start w:val="1"/>
+      <w:numFmt w:val="bullet"/>
+      <w:lvlText w:val=""/>
+      <w:lvlJc w:val="left"/>
+      <w:pPr>
+        <w:ind w:left="4680" w:hanging="360"/>
+      </w:pPr>
+      <w:rPr>
+        <w:rFonts w:ascii="Symbol" w:hAnsi="Symbol" w:hint="default"/>
+      </w:rPr>
+    </w:lvl>
+    <w:lvl w:ilvl="7" w:tplc="04090003" w:tentative="1">
+      <w:start w:val="1"/>
+      <w:numFmt w:val="bullet"/>
+      <w:lvlText w:val="o"/>
+      <w:lvlJc w:val="left"/>
+      <w:pPr>
+        <w:ind w:left="5400" w:hanging="360"/>
+      </w:pPr>
+      <w:rPr>
+        <w:rFonts w:ascii="Courier New" w:hAnsi="Courier New" w:cs="Courier New" w:hint="default"/>
+      </w:rPr>
+    </w:lvl>
+    <w:lvl w:ilvl="8" w:tplc="04090005" w:tentative="1">
+      <w:start w:val="1"/>
+      <w:numFmt w:val="bullet"/>
+      <w:lvlText w:val=""/>
+      <w:lvlJc w:val="left"/>
+      <w:pPr>
+        <w:ind w:left="6120" w:hanging="360"/>
+      </w:pPr>
+      <w:rPr>
+        <w:rFonts w:ascii="Wingdings" w:hAnsi="Wingdings" w:hint="default"/>
+      </w:rPr>
+    </w:lvl>
+  </w:abstractNum>
+  <w:abstractNum w:abstractNumId="18" w15:restartNumberingAfterBreak="0">
     <w:nsid w:val="781879A2"/>
     <w:multiLevelType w:val="hybridMultilevel"/>
     <w:tmpl w:val="091025E6"/>
@@ -3022,7 +3185,7 @@
     <w:abstractNumId w:val="9"/>
   </w:num>
   <w:num w:numId="2" w16cid:durableId="771047357">
-    <w:abstractNumId w:val="17"/>
+    <w:abstractNumId w:val="18"/>
   </w:num>
   <w:num w:numId="3" w16cid:durableId="2098016943">
     <w:abstractNumId w:val="3"/>
@@ -3071,6 +3234,9 @@
   </w:num>
   <w:num w:numId="18" w16cid:durableId="1014453346">
     <w:abstractNumId w:val="14"/>
+  </w:num>
+  <w:num w:numId="19" w16cid:durableId="1135946126">
+    <w:abstractNumId w:val="17"/>
   </w:num>
 </w:numbering>
 </file>

</xml_diff>